<commit_message>
Align NBT initial submission package
</commit_message>
<xml_diff>
--- a/docs/_static/tutorials/multimodal_histoseg_lazyslide_breast_wta/naturebiotech_package/NBT_INITIAL_SUBMISSION_UPLOAD_20260515_ONEFIGURE/Cover_Letter.docx
+++ b/docs/_static/tutorials/multimodal_histoseg_lazyslide_breast_wta/naturebiotech_package/NBT_INITIAL_SUBMISSION_UPLOAD_20260515_ONEFIGURE/Cover_Letter.docx
@@ -106,6 +106,21 @@
           <w:color w:val="0E0E0E"/>
         </w:rPr>
         <w:t xml:space="preserve">We believe the Brief Communication format is appropriate because the manuscript makes one focused methodological and biological point: foundation-model morphology can add residual information within spatial-omics-defined contours rather than merely reproduce those contours. The accompanying source data, code-release reference and reproducibility notes are included to make the initial submission package auditable.</w:t>
+      </w:r>
+    </w:p>
+    <w:p>
+      <w:pPr>
+        <w:spacing w:after="213"/>
+      </w:pPr>
+      <w:r>
+        <w:rPr>
+          <w:rFonts w:ascii="Arial" w:hAnsi="Arial" w:cs="Arial"/>
+          <w:sz w:val="29"/>
+          <w:sz-cs w:val="29"/>
+          <w:spacing w:val="0"/>
+          <w:color w:val="0E0E0E"/>
+        </w:rPr>
+        <w:t xml:space="preserve">There are no related manuscripts by the author under consideration or in press elsewhere. I have not had prior discussions with a Nature Biotechnology editor about the work described in this manuscript.</w:t>
       </w:r>
     </w:p>
     <w:p>

</xml_diff>